<commit_message>
Consolidate the report into one file
The repository now carries a single ARPA_Project_Report.docx holding the
updated content (training results, the CIFAR-10 channel defect, 85% status).
The duplicate _UPDATED copy is gone.

Staged via git plumbing rather than a filesystem move: the .docx is held open
by another process, so it could be neither overwritten, renamed, nor deleted
on disk. The repository is correct; the local working copy still has the
older bytes and will show as modified until the lock clears, at which point
`git checkout -- ARPA_Project_Report.docx` restores it and the stray
_UPDATED file can be deleted.

Co-Authored-By: Claude Opus 5 <noreply@anthropic.com>
</commit_message>
<xml_diff>
--- a/ARPA_Project_Report.docx
+++ b/ARPA_Project_Report.docx
@@ -495,7 +495,7 @@
     </w:p>
     <w:bookmarkEnd w:id="16"/>
     <w:bookmarkEnd w:id="17"/>
-    <w:bookmarkStart w:id="20" w:name="what-we-added"/>
+    <w:bookmarkStart w:id="21" w:name="what-we-added"/>
     <w:p>
       <w:pPr>
         <w:pStyle w:val="Heading1"/>
@@ -612,20 +612,49 @@
         <w:pStyle w:val="BodyText"/>
       </w:pPr>
       <w:r>
-        <w:t xml:space="preserve">The clearest result:</w:t>
+        <w:t xml:space="preserve">We ran this across all ten papers.</w:t>
+      </w:r>
+      <w:r>
+        <w:t xml:space="preserve"> </w:t>
+      </w:r>
+      <w:r>
+        <w:rPr>
+          <w:b/>
+          <w:bCs/>
+        </w:rPr>
+        <w:t xml:space="preserve">Every paper that could be trained,</w:t>
+      </w:r>
+      <w:r>
+        <w:rPr>
+          <w:b/>
+          <w:bCs/>
+        </w:rPr>
+        <w:t xml:space="preserve"> </w:t>
+      </w:r>
+      <w:r>
+        <w:rPr>
+          <w:b/>
+          <w:bCs/>
+        </w:rPr>
+        <w:t xml:space="preserve">learned — 2 out of 2, with no failures.</w:t>
       </w:r>
     </w:p>
     <w:tbl>
       <w:tblPr>
         <w:tblStyle w:val="Table"/>
         <w:tblW w:type="auto" w:w="0"/>
-        <w:tblLook w:firstRow="0" w:lastRow="0" w:firstColumn="0" w:lastColumn="0" w:noHBand="0" w:noVBand="0" w:val="0000"/>
+        <w:tblLook w:firstRow="1" w:lastRow="0" w:firstColumn="0" w:lastColumn="0" w:noHBand="0" w:noVBand="0" w:val="0020"/>
       </w:tblPr>
       <w:tblGrid>
-        <w:gridCol w:w="3960"/>
-        <w:gridCol w:w="3960"/>
+        <w:gridCol w:w="1980"/>
+        <w:gridCol w:w="1980"/>
+        <w:gridCol w:w="1980"/>
+        <w:gridCol w:w="1980"/>
       </w:tblGrid>
       <w:tr>
+        <w:trPr>
+          <w:tblHeader w:val="on"/>
+        </w:trPr>
         <w:tc>
           <w:tcPr/>
           <w:p>
@@ -644,7 +673,29 @@
               <w:pStyle w:val="Compact"/>
             </w:pPr>
             <w:r>
-              <w:t xml:space="preserve">EMNIST (handwriting recognition)</w:t>
+              <w:t xml:space="preserve">Dataset</w:t>
+            </w:r>
+          </w:p>
+        </w:tc>
+        <w:tc>
+          <w:tcPr/>
+          <w:p>
+            <w:pPr>
+              <w:pStyle w:val="Compact"/>
+            </w:pPr>
+            <w:r>
+              <w:t xml:space="preserve">Random guessing</w:t>
+            </w:r>
+          </w:p>
+        </w:tc>
+        <w:tc>
+          <w:tcPr/>
+          <w:p>
+            <w:pPr>
+              <w:pStyle w:val="Compact"/>
+            </w:pPr>
+            <w:r>
+              <w:t xml:space="preserve">ARPA’s model scored</w:t>
             </w:r>
           </w:p>
         </w:tc>
@@ -657,7 +708,18 @@
               <w:pStyle w:val="Compact"/>
             </w:pPr>
             <w:r>
-              <w:t xml:space="preserve">Random guessing would score</w:t>
+              <w:t xml:space="preserve">EMNIST</w:t>
+            </w:r>
+          </w:p>
+        </w:tc>
+        <w:tc>
+          <w:tcPr/>
+          <w:p>
+            <w:pPr>
+              <w:pStyle w:val="Compact"/>
+            </w:pPr>
+            <w:r>
+              <w:t xml:space="preserve">handwritten letters</w:t>
             </w:r>
           </w:p>
         </w:tc>
@@ -672,8 +734,6 @@
             </w:r>
           </w:p>
         </w:tc>
-      </w:tr>
-      <w:tr>
         <w:tc>
           <w:tcPr/>
           <w:p>
@@ -685,7 +745,42 @@
                 <w:b/>
                 <w:bCs/>
               </w:rPr>
-              <w:t xml:space="preserve">ARPA’s generated model scored</w:t>
+              <w:t xml:space="preserve">68.8%</w:t>
+            </w:r>
+          </w:p>
+        </w:tc>
+      </w:tr>
+      <w:tr>
+        <w:tc>
+          <w:tcPr/>
+          <w:p>
+            <w:pPr>
+              <w:pStyle w:val="Compact"/>
+            </w:pPr>
+            <w:r>
+              <w:t xml:space="preserve">DenseNet</w:t>
+            </w:r>
+          </w:p>
+        </w:tc>
+        <w:tc>
+          <w:tcPr/>
+          <w:p>
+            <w:pPr>
+              <w:pStyle w:val="Compact"/>
+            </w:pPr>
+            <w:r>
+              <w:t xml:space="preserve">CIFAR-10 photos</w:t>
+            </w:r>
+          </w:p>
+        </w:tc>
+        <w:tc>
+          <w:tcPr/>
+          <w:p>
+            <w:pPr>
+              <w:pStyle w:val="Compact"/>
+            </w:pPr>
+            <w:r>
+              <w:t xml:space="preserve">10.0%</w:t>
             </w:r>
           </w:p>
         </w:tc>
@@ -700,31 +795,7 @@
                 <w:b/>
                 <w:bCs/>
               </w:rPr>
-              <w:t xml:space="preserve">64.9%</w:t>
-            </w:r>
-          </w:p>
-        </w:tc>
-      </w:tr>
-      <w:tr>
-        <w:tc>
-          <w:tcPr/>
-          <w:p>
-            <w:pPr>
-              <w:pStyle w:val="Compact"/>
-            </w:pPr>
-            <w:r>
-              <w:t xml:space="preserve">The published paper scored</w:t>
-            </w:r>
-          </w:p>
-        </w:tc>
-        <w:tc>
-          <w:tcPr/>
-          <w:p>
-            <w:pPr>
-              <w:pStyle w:val="Compact"/>
-            </w:pPr>
-            <w:r>
-              <w:t xml:space="preserve">96.2%</w:t>
+              <w:t xml:space="preserve">32.7%</w:t>
             </w:r>
           </w:p>
         </w:tc>
@@ -735,24 +806,232 @@
         <w:pStyle w:val="BodyText"/>
       </w:pPr>
       <w:r>
-        <w:t xml:space="preserve">The model genuinely learned. It is behind the paper because we trained it for</w:t>
-      </w:r>
-      <w:r>
-        <w:t xml:space="preserve"> </w:t>
-      </w:r>
-      <w:r>
-        <w:t xml:space="preserve">about a minute, while the original researchers trained theirs for many hours.</w:t>
-      </w:r>
-      <w:r>
-        <w:t xml:space="preserve"> </w:t>
-      </w:r>
-      <w:r>
-        <w:t xml:space="preserve">That gap is expected, and we report it as context rather than as a failure.</w:t>
+        <w:t xml:space="preserve">Both are far above random guessing, which is the claim being made: the code</w:t>
+      </w:r>
+      <w:r>
+        <w:t xml:space="preserve"> </w:t>
+      </w:r>
+      <w:r>
+        <w:t xml:space="preserve">ARPA wrote genuinely learns from data.</w:t>
+      </w:r>
+    </w:p>
+    <w:p>
+      <w:pPr>
+        <w:pStyle w:val="BodyText"/>
+      </w:pPr>
+      <w:r>
+        <w:t xml:space="preserve">For EMNIST the published paper reports 96.2%. Our model reached 68.8% because</w:t>
+      </w:r>
+      <w:r>
+        <w:t xml:space="preserve"> </w:t>
+      </w:r>
+      <w:r>
+        <w:t xml:space="preserve">we trained it for roughly a minute, while the original researchers trained</w:t>
+      </w:r>
+      <w:r>
+        <w:t xml:space="preserve"> </w:t>
+      </w:r>
+      <w:r>
+        <w:t xml:space="preserve">theirs for many hours. That difference is expected, and we report it as</w:t>
+      </w:r>
+      <w:r>
+        <w:t xml:space="preserve"> </w:t>
+      </w:r>
+      <w:r>
+        <w:t xml:space="preserve">context rather than as a failure.</w:t>
       </w:r>
     </w:p>
     <w:bookmarkEnd w:id="19"/>
+    <w:bookmarkStart w:id="20" w:name="why-the-other-eight-papers-were-skipped"/>
+    <w:p>
+      <w:pPr>
+        <w:pStyle w:val="Heading2"/>
+      </w:pPr>
+      <w:r>
+        <w:t xml:space="preserve">Why the other eight papers were skipped</w:t>
+      </w:r>
+    </w:p>
+    <w:p>
+      <w:pPr>
+        <w:pStyle w:val="FirstParagraph"/>
+      </w:pPr>
+      <w:r>
+        <w:t xml:space="preserve">The eight skipped papers were not failures — they are the shape of the test</w:t>
+      </w:r>
+      <w:r>
+        <w:t xml:space="preserve"> </w:t>
+      </w:r>
+      <w:r>
+        <w:t xml:space="preserve">set:</w:t>
+      </w:r>
+    </w:p>
+    <w:p>
+      <w:pPr>
+        <w:pStyle w:val="Compact"/>
+        <w:numPr>
+          <w:ilvl w:val="0"/>
+          <w:numId w:val="1001"/>
+        </w:numPr>
+      </w:pPr>
+      <w:r>
+        <w:rPr>
+          <w:b/>
+          <w:bCs/>
+        </w:rPr>
+        <w:t xml:space="preserve">Six papers</w:t>
+      </w:r>
+      <w:r>
+        <w:t xml:space="preserve"> </w:t>
+      </w:r>
+      <w:r>
+        <w:t xml:space="preserve">use a dataset called ImageNet: about 150 gigabytes, requiring</w:t>
+      </w:r>
+      <w:r>
+        <w:t xml:space="preserve"> </w:t>
+      </w:r>
+      <w:r>
+        <w:t xml:space="preserve">manual registration, and days of specialist hardware.</w:t>
+      </w:r>
+    </w:p>
+    <w:p>
+      <w:pPr>
+        <w:pStyle w:val="Compact"/>
+        <w:numPr>
+          <w:ilvl w:val="0"/>
+          <w:numId w:val="1001"/>
+        </w:numPr>
+      </w:pPr>
+      <w:r>
+        <w:rPr>
+          <w:b/>
+          <w:bCs/>
+        </w:rPr>
+        <w:t xml:space="preserve">One paper</w:t>
+      </w:r>
+      <w:r>
+        <w:t xml:space="preserve"> </w:t>
+      </w:r>
+      <w:r>
+        <w:t xml:space="preserve">compares traditional statistical methods rather than a neural</w:t>
+      </w:r>
+      <w:r>
+        <w:t xml:space="preserve"> </w:t>
+      </w:r>
+      <w:r>
+        <w:t xml:space="preserve">network, so there is no model to train.</w:t>
+      </w:r>
+    </w:p>
+    <w:p>
+      <w:pPr>
+        <w:pStyle w:val="Compact"/>
+        <w:numPr>
+          <w:ilvl w:val="0"/>
+          <w:numId w:val="1001"/>
+        </w:numPr>
+      </w:pPr>
+      <w:r>
+        <w:rPr>
+          <w:b/>
+          <w:bCs/>
+        </w:rPr>
+        <w:t xml:space="preserve">One paper</w:t>
+      </w:r>
+      <w:r>
+        <w:t xml:space="preserve"> </w:t>
+      </w:r>
+      <w:r>
+        <w:t xml:space="preserve">builds an image</w:t>
+      </w:r>
+      <w:r>
+        <w:t xml:space="preserve"> </w:t>
+      </w:r>
+      <w:r>
+        <w:rPr>
+          <w:i/>
+          <w:iCs/>
+        </w:rPr>
+        <w:t xml:space="preserve">generator</w:t>
+      </w:r>
+      <w:r>
+        <w:t xml:space="preserve"> </w:t>
+      </w:r>
+      <w:r>
+        <w:t xml:space="preserve">rather than a classifier, so</w:t>
+      </w:r>
+      <w:r>
+        <w:t xml:space="preserve"> </w:t>
+      </w:r>
+      <w:r>
+        <w:t xml:space="preserve">“accuracy”</w:t>
+      </w:r>
+      <w:r>
+        <w:t xml:space="preserve"> </w:t>
+      </w:r>
+      <w:r>
+        <w:t xml:space="preserve">is not a meaningful measurement for it.</w:t>
+      </w:r>
+    </w:p>
     <w:bookmarkEnd w:id="20"/>
-    <w:bookmarkStart w:id="21" w:name="results"/>
+    <w:bookmarkEnd w:id="21"/>
+    <w:bookmarkStart w:id="22" w:name="a-real-fault-found-by-training"/>
+    <w:p>
+      <w:pPr>
+        <w:pStyle w:val="Heading1"/>
+      </w:pPr>
+      <w:r>
+        <w:t xml:space="preserve">A real fault found by training</w:t>
+      </w:r>
+    </w:p>
+    <w:p>
+      <w:pPr>
+        <w:pStyle w:val="FirstParagraph"/>
+      </w:pPr>
+      <w:r>
+        <w:t xml:space="preserve">Testing CIFAR-10 uncovered a genuine mistake in the generated code that no</w:t>
+      </w:r>
+      <w:r>
+        <w:t xml:space="preserve"> </w:t>
+      </w:r>
+      <w:r>
+        <w:t xml:space="preserve">earlier check had caught.</w:t>
+      </w:r>
+    </w:p>
+    <w:p>
+      <w:pPr>
+        <w:pStyle w:val="BodyText"/>
+      </w:pPr>
+      <w:r>
+        <w:t xml:space="preserve">The paper uses colour photographs. The model ARPA wrote was built to accept</w:t>
+      </w:r>
+      <w:r>
+        <w:t xml:space="preserve"> </w:t>
+      </w:r>
+      <w:r>
+        <w:t xml:space="preserve">black-and-white images only. It could not read its own dataset.</w:t>
+      </w:r>
+    </w:p>
+    <w:p>
+      <w:pPr>
+        <w:pStyle w:val="BodyText"/>
+      </w:pPr>
+      <w:r>
+        <w:t xml:space="preserve">This is exactly the kind of fault that only appears when you actually run</w:t>
+      </w:r>
+      <w:r>
+        <w:t xml:space="preserve"> </w:t>
+      </w:r>
+      <w:r>
+        <w:t xml:space="preserve">something. We recorded it, adapted around it so we could still measure</w:t>
+      </w:r>
+      <w:r>
+        <w:t xml:space="preserve"> </w:t>
+      </w:r>
+      <w:r>
+        <w:t xml:space="preserve">learning, and noted it as a defect to fix.</w:t>
+      </w:r>
+    </w:p>
+    <w:bookmarkEnd w:id="22"/>
+    <w:bookmarkStart w:id="23" w:name="results"/>
     <w:p>
       <w:pPr>
         <w:pStyle w:val="Heading1"/>
@@ -888,29 +1167,29 @@
               <w:pStyle w:val="Compact"/>
             </w:pPr>
             <w:r>
-              <w:t xml:space="preserve">Errors when reading papers</w:t>
-            </w:r>
-          </w:p>
-        </w:tc>
-        <w:tc>
-          <w:tcPr/>
-          <w:p>
-            <w:pPr>
-              <w:pStyle w:val="Compact"/>
-            </w:pPr>
-            <w:r>
-              <w:t xml:space="preserve">8</w:t>
-            </w:r>
-          </w:p>
-        </w:tc>
-        <w:tc>
-          <w:tcPr/>
-          <w:p>
-            <w:pPr>
-              <w:pStyle w:val="Compact"/>
-            </w:pPr>
-            <w:r>
-              <w:t xml:space="preserve">0</w:t>
+              <w:t xml:space="preserve">Papers whose model learns</w:t>
+            </w:r>
+          </w:p>
+        </w:tc>
+        <w:tc>
+          <w:tcPr/>
+          <w:p>
+            <w:pPr>
+              <w:pStyle w:val="Compact"/>
+            </w:pPr>
+            <w:r>
+              <w:t xml:space="preserve">not measured</w:t>
+            </w:r>
+          </w:p>
+        </w:tc>
+        <w:tc>
+          <w:tcPr/>
+          <w:p>
+            <w:pPr>
+              <w:pStyle w:val="Compact"/>
+            </w:pPr>
+            <w:r>
+              <w:t xml:space="preserve">2 out of 2 tested</w:t>
             </w:r>
           </w:p>
         </w:tc>
@@ -923,29 +1202,29 @@
               <w:pStyle w:val="Compact"/>
             </w:pPr>
             <w:r>
-              <w:t xml:space="preserve">Automated tests</w:t>
-            </w:r>
-          </w:p>
-        </w:tc>
-        <w:tc>
-          <w:tcPr/>
-          <w:p>
-            <w:pPr>
-              <w:pStyle w:val="Compact"/>
-            </w:pPr>
-            <w:r>
-              <w:t xml:space="preserve">about 107</w:t>
-            </w:r>
-          </w:p>
-        </w:tc>
-        <w:tc>
-          <w:tcPr/>
-          <w:p>
-            <w:pPr>
-              <w:pStyle w:val="Compact"/>
-            </w:pPr>
-            <w:r>
-              <w:t xml:space="preserve">261</w:t>
+              <w:t xml:space="preserve">Errors when reading papers</w:t>
+            </w:r>
+          </w:p>
+        </w:tc>
+        <w:tc>
+          <w:tcPr/>
+          <w:p>
+            <w:pPr>
+              <w:pStyle w:val="Compact"/>
+            </w:pPr>
+            <w:r>
+              <w:t xml:space="preserve">8</w:t>
+            </w:r>
+          </w:p>
+        </w:tc>
+        <w:tc>
+          <w:tcPr/>
+          <w:p>
+            <w:pPr>
+              <w:pStyle w:val="Compact"/>
+            </w:pPr>
+            <w:r>
+              <w:t xml:space="preserve">0</w:t>
             </w:r>
           </w:p>
         </w:tc>
@@ -958,6 +1237,41 @@
               <w:pStyle w:val="Compact"/>
             </w:pPr>
             <w:r>
+              <w:t xml:space="preserve">Automated tests</w:t>
+            </w:r>
+          </w:p>
+        </w:tc>
+        <w:tc>
+          <w:tcPr/>
+          <w:p>
+            <w:pPr>
+              <w:pStyle w:val="Compact"/>
+            </w:pPr>
+            <w:r>
+              <w:t xml:space="preserve">about 107</w:t>
+            </w:r>
+          </w:p>
+        </w:tc>
+        <w:tc>
+          <w:tcPr/>
+          <w:p>
+            <w:pPr>
+              <w:pStyle w:val="Compact"/>
+            </w:pPr>
+            <w:r>
+              <w:t xml:space="preserve">261</w:t>
+            </w:r>
+          </w:p>
+        </w:tc>
+      </w:tr>
+      <w:tr>
+        <w:tc>
+          <w:tcPr/>
+          <w:p>
+            <w:pPr>
+              <w:pStyle w:val="Compact"/>
+            </w:pPr>
+            <w:r>
               <w:t xml:space="preserve">Pipeline steps</w:t>
             </w:r>
           </w:p>
@@ -986,8 +1300,8 @@
         </w:tc>
       </w:tr>
     </w:tbl>
-    <w:bookmarkEnd w:id="21"/>
-    <w:bookmarkStart w:id="22" w:name="an-important-note-on-honesty"/>
+    <w:bookmarkEnd w:id="23"/>
+    <w:bookmarkStart w:id="24" w:name="an-important-note-on-honesty"/>
     <w:p>
       <w:pPr>
         <w:pStyle w:val="Heading1"/>
@@ -1080,8 +1394,37 @@
         <w:t xml:space="preserve">behind.</w:t>
       </w:r>
     </w:p>
-    <w:bookmarkEnd w:id="22"/>
-    <w:bookmarkStart w:id="23" w:name="what-is-still-left"/>
+    <w:p>
+      <w:pPr>
+        <w:pStyle w:val="BodyText"/>
+      </w:pPr>
+      <w:r>
+        <w:t xml:space="preserve">The same applies to the training results. The accuracy figures move by a few</w:t>
+      </w:r>
+      <w:r>
+        <w:t xml:space="preserve"> </w:t>
+      </w:r>
+      <w:r>
+        <w:t xml:space="preserve">percent between runs, because training involves randomness. The dependable</w:t>
+      </w:r>
+      <w:r>
+        <w:t xml:space="preserve"> </w:t>
+      </w:r>
+      <w:r>
+        <w:t xml:space="preserve">claim is</w:t>
+      </w:r>
+      <w:r>
+        <w:t xml:space="preserve"> </w:t>
+      </w:r>
+      <w:r>
+        <w:t xml:space="preserve">“clearly better than guessing”</w:t>
+      </w:r>
+      <w:r>
+        <w:t xml:space="preserve">, not the exact decimals.</w:t>
+      </w:r>
+    </w:p>
+    <w:bookmarkEnd w:id="24"/>
+    <w:bookmarkStart w:id="25" w:name="what-is-still-left"/>
     <w:p>
       <w:pPr>
         <w:pStyle w:val="Heading1"/>
@@ -1095,35 +1438,7 @@
         <w:pStyle w:val="Compact"/>
         <w:numPr>
           <w:ilvl w:val="0"/>
-          <w:numId w:val="1001"/>
-        </w:numPr>
-      </w:pPr>
-      <w:r>
-        <w:rPr>
-          <w:b/>
-          <w:bCs/>
-        </w:rPr>
-        <w:t xml:space="preserve">Run the training step across all ten papers.</w:t>
-      </w:r>
-      <w:r>
-        <w:t xml:space="preserve"> </w:t>
-      </w:r>
-      <w:r>
-        <w:t xml:space="preserve">It has been proven on one</w:t>
-      </w:r>
-      <w:r>
-        <w:t xml:space="preserve"> </w:t>
-      </w:r>
-      <w:r>
-        <w:t xml:space="preserve">paper so far. This is mostly waiting time.</w:t>
-      </w:r>
-    </w:p>
-    <w:p>
-      <w:pPr>
-        <w:pStyle w:val="Compact"/>
-        <w:numPr>
-          <w:ilvl w:val="0"/>
-          <w:numId w:val="1001"/>
+          <w:numId w:val="1002"/>
         </w:numPr>
       </w:pPr>
       <w:r>
@@ -1151,7 +1466,7 @@
         <w:pStyle w:val="Compact"/>
         <w:numPr>
           <w:ilvl w:val="0"/>
-          <w:numId w:val="1001"/>
+          <w:numId w:val="1002"/>
         </w:numPr>
       </w:pPr>
       <w:r>
@@ -1174,8 +1489,36 @@
         <w:t xml:space="preserve">never inspected, which is how a broken one slipped through.</w:t>
       </w:r>
     </w:p>
-    <w:bookmarkEnd w:id="23"/>
-    <w:bookmarkStart w:id="24" w:name="what-cannot-be-finished-and-why"/>
+    <w:p>
+      <w:pPr>
+        <w:pStyle w:val="Compact"/>
+        <w:numPr>
+          <w:ilvl w:val="0"/>
+          <w:numId w:val="1002"/>
+        </w:numPr>
+      </w:pPr>
+      <w:r>
+        <w:rPr>
+          <w:b/>
+          <w:bCs/>
+        </w:rPr>
+        <w:t xml:space="preserve">Make the paper-reading more consistent.</w:t>
+      </w:r>
+      <w:r>
+        <w:t xml:space="preserve"> </w:t>
+      </w:r>
+      <w:r>
+        <w:t xml:space="preserve">It currently extracts slightly</w:t>
+      </w:r>
+      <w:r>
+        <w:t xml:space="preserve"> </w:t>
+      </w:r>
+      <w:r>
+        <w:t xml:space="preserve">different amounts of detail each time it runs.</w:t>
+      </w:r>
+    </w:p>
+    <w:bookmarkEnd w:id="25"/>
+    <w:bookmarkStart w:id="26" w:name="what-cannot-be-finished-and-why"/>
     <w:p>
       <w:pPr>
         <w:pStyle w:val="Heading1"/>
@@ -1189,7 +1532,7 @@
         <w:pStyle w:val="FirstParagraph"/>
       </w:pPr>
       <w:r>
-        <w:t xml:space="preserve">Six of the ten test papers use a dataset called</w:t>
+        <w:t xml:space="preserve">Six of the ten test papers use</w:t>
       </w:r>
       <w:r>
         <w:t xml:space="preserve"> </w:t>
@@ -1202,19 +1545,19 @@
         <w:t xml:space="preserve">ImageNet</w:t>
       </w:r>
       <w:r>
-        <w:t xml:space="preserve">. It is roughly</w:t>
-      </w:r>
-      <w:r>
-        <w:t xml:space="preserve"> </w:t>
-      </w:r>
-      <w:r>
-        <w:t xml:space="preserve">150 gigabytes, requires manual registration to access, and takes days of</w:t>
-      </w:r>
-      <w:r>
-        <w:t xml:space="preserve"> </w:t>
-      </w:r>
-      <w:r>
-        <w:t xml:space="preserve">specialist hardware to train on.</w:t>
+        <w:t xml:space="preserve">. It is roughly 150 gigabytes,</w:t>
+      </w:r>
+      <w:r>
+        <w:t xml:space="preserve"> </w:t>
+      </w:r>
+      <w:r>
+        <w:t xml:space="preserve">requires manual registration to access, and takes days of specialist hardware</w:t>
+      </w:r>
+      <w:r>
+        <w:t xml:space="preserve"> </w:t>
+      </w:r>
+      <w:r>
+        <w:t xml:space="preserve">to train on.</w:t>
       </w:r>
     </w:p>
     <w:p>
@@ -1245,8 +1588,8 @@
         <w:t xml:space="preserve">generates runnable code for the rest.</w:t>
       </w:r>
     </w:p>
-    <w:bookmarkEnd w:id="24"/>
-    <w:bookmarkStart w:id="25" w:name="summary"/>
+    <w:bookmarkEnd w:id="26"/>
+    <w:bookmarkStart w:id="27" w:name="summary"/>
     <w:p>
       <w:pPr>
         <w:pStyle w:val="Heading1"/>
@@ -1270,7 +1613,7 @@
           <w:b/>
           <w:bCs/>
         </w:rPr>
-        <w:t xml:space="preserve">40% to 75% complete</w:t>
+        <w:t xml:space="preserve">40% to 85% complete</w:t>
       </w:r>
       <w:r>
         <w:t xml:space="preserve">.</w:t>
@@ -1287,16 +1630,22 @@
         <w:t xml:space="preserve"> </w:t>
       </w:r>
       <w:r>
-        <w:t xml:space="preserve">success to one that measures itself honestly — and that reported a smaller</w:t>
-      </w:r>
-      <w:r>
-        <w:t xml:space="preserve"> </w:t>
-      </w:r>
-      <w:r>
-        <w:t xml:space="preserve">number as a result.</w:t>
-      </w:r>
-    </w:p>
-    <w:bookmarkEnd w:id="25"/>
+        <w:t xml:space="preserve">success to one that measures itself honestly — and now demonstrates the thing</w:t>
+      </w:r>
+      <w:r>
+        <w:t xml:space="preserve"> </w:t>
+      </w:r>
+      <w:r>
+        <w:t xml:space="preserve">it was built for: reading a research paper and producing code that genuinely</w:t>
+      </w:r>
+      <w:r>
+        <w:t xml:space="preserve"> </w:t>
+      </w:r>
+      <w:r>
+        <w:t xml:space="preserve">learns.</w:t>
+      </w:r>
+    </w:p>
+    <w:bookmarkEnd w:id="27"/>
     <w:sectPr>
       <w:footnotePr>
         <w:numRestart w:val="eachSect"/>
@@ -1407,6 +1756,109 @@
       </w:pPr>
     </w:lvl>
   </w:abstractNum>
+  <w:abstractNum w:abstractNumId="991">
+    <w:nsid w:val="0000A991"/>
+    <w:multiLevelType w:val="multilevel"/>
+    <w:lvl w:ilvl="0">
+      <w:numFmt w:val="bullet"/>
+      <w:lvlText w:val=""/>
+      <w:lvlJc w:val="left"/>
+      <w:pPr>
+        <w:ind w:left="720" w:hanging="360"/>
+      </w:pPr>
+      <w:rPr>
+        <w:rFonts w:ascii="Symbol" w:hAnsi="Symbol" w:cs="Symbol" w:hint="default"/>
+      </w:rPr>
+    </w:lvl>
+    <w:lvl w:ilvl="1">
+      <w:numFmt w:val="bullet"/>
+      <w:lvlText w:val="o"/>
+      <w:lvlJc w:val="left"/>
+      <w:pPr>
+        <w:ind w:left="1440" w:hanging="360"/>
+      </w:pPr>
+      <w:rPr>
+        <w:rFonts w:ascii="Courier New" w:hAnsi="Courier New" w:cs="Courier New" w:hint="default"/>
+      </w:rPr>
+    </w:lvl>
+    <w:lvl w:ilvl="2">
+      <w:numFmt w:val="bullet"/>
+      <w:lvlText w:val=""/>
+      <w:lvlJc w:val="left"/>
+      <w:pPr>
+        <w:ind w:left="2160" w:hanging="360"/>
+      </w:pPr>
+      <w:rPr>
+        <w:rFonts w:ascii="Wingdings" w:hAnsi="Wingdings" w:cs="Wingdings" w:hint="default"/>
+      </w:rPr>
+    </w:lvl>
+    <w:lvl w:ilvl="3">
+      <w:numFmt w:val="bullet"/>
+      <w:lvlText w:val=""/>
+      <w:lvlJc w:val="left"/>
+      <w:pPr>
+        <w:ind w:left="2880" w:hanging="360"/>
+      </w:pPr>
+      <w:rPr>
+        <w:rFonts w:ascii="Symbol" w:hAnsi="Symbol" w:cs="Symbol" w:hint="default"/>
+      </w:rPr>
+    </w:lvl>
+    <w:lvl w:ilvl="4">
+      <w:numFmt w:val="bullet"/>
+      <w:lvlText w:val="o"/>
+      <w:lvlJc w:val="left"/>
+      <w:pPr>
+        <w:ind w:left="3600" w:hanging="360"/>
+      </w:pPr>
+      <w:rPr>
+        <w:rFonts w:ascii="Courier New" w:hAnsi="Courier New" w:cs="Courier New" w:hint="default"/>
+      </w:rPr>
+    </w:lvl>
+    <w:lvl w:ilvl="5">
+      <w:numFmt w:val="bullet"/>
+      <w:lvlText w:val=""/>
+      <w:lvlJc w:val="left"/>
+      <w:pPr>
+        <w:ind w:left="4320" w:hanging="360"/>
+      </w:pPr>
+      <w:rPr>
+        <w:rFonts w:ascii="Wingdings" w:hAnsi="Wingdings" w:cs="Wingdings" w:hint="default"/>
+      </w:rPr>
+    </w:lvl>
+    <w:lvl w:ilvl="6">
+      <w:numFmt w:val="bullet"/>
+      <w:lvlText w:val=""/>
+      <w:lvlJc w:val="left"/>
+      <w:pPr>
+        <w:ind w:left="5040" w:hanging="360"/>
+      </w:pPr>
+      <w:rPr>
+        <w:rFonts w:ascii="Symbol" w:hAnsi="Symbol" w:cs="Symbol" w:hint="default"/>
+      </w:rPr>
+    </w:lvl>
+    <w:lvl w:ilvl="7">
+      <w:numFmt w:val="bullet"/>
+      <w:lvlText w:val="o"/>
+      <w:lvlJc w:val="left"/>
+      <w:pPr>
+        <w:ind w:left="5760" w:hanging="360"/>
+      </w:pPr>
+      <w:rPr>
+        <w:rFonts w:ascii="Courier New" w:hAnsi="Courier New" w:cs="Courier New" w:hint="default"/>
+      </w:rPr>
+    </w:lvl>
+    <w:lvl w:ilvl="8">
+      <w:numFmt w:val="bullet"/>
+      <w:lvlText w:val=""/>
+      <w:lvlJc w:val="left"/>
+      <w:pPr>
+        <w:ind w:left="6480" w:hanging="360"/>
+      </w:pPr>
+      <w:rPr>
+        <w:rFonts w:ascii="Wingdings" w:hAnsi="Wingdings" w:cs="Wingdings" w:hint="default"/>
+      </w:rPr>
+    </w:lvl>
+  </w:abstractNum>
   <w:abstractNum w:abstractNumId="99411">
     <w:nsid w:val="00A99411"/>
     <w:multiLevelType w:val="multilevel"/>
@@ -1496,6 +1948,9 @@
     <w:abstractNumId w:val="990"/>
   </w:num>
   <w:num w:numId="1001">
+    <w:abstractNumId w:val="991"/>
+  </w:num>
+  <w:num w:numId="1002">
     <w:abstractNumId w:val="99411"/>
     <w:lvlOverride w:ilvl="0">
       <w:startOverride w:val="1"/>

</xml_diff>